<commit_message>
feat: ajuste de conectividade no packet e adição da doc Mitre
</commit_message>
<xml_diff>
--- a/Docs/Relatorios/MITRE.docx
+++ b/Docs/Relatorios/MITRE.docx
@@ -539,7 +539,7 @@
       </w:pPr>
       <w:r>
         <w:lastRenderedPageBreak/>
-        <w:t>MAPEAMENTO TÁTICO E TÉCNICO DE AMEAÇAS (FRAMEWORK MITRE ATT&amp;CK)</w:t>
+        <w:t>Mini Plano Diretor de Segurança da Informação Fundamentado Em MITRE ATT&amp;CK</w:t>
       </w:r>
     </w:p>
     <w:p>
@@ -567,24 +567,36 @@
         <w:ind w:right="2"/>
       </w:pPr>
       <w:r>
-        <w:t>Acesso Inicial (</w:t>
-      </w:r>
-      <w:r>
-        <w:rPr>
-          <w:i/>
-          <w:iCs/>
-        </w:rPr>
-        <w:t>Initial Access</w:t>
-      </w:r>
-      <w:r>
-        <w:t>): O objetivo do adversário nesta tática é obter o primeiro ponto de apoio na rede. As técnicas prioritárias identificadas incluem o uso de contas válidas e a exploração de aplicações voltadas para a rede externa. Como mitigação arquitetural, propõe-se um controle rigoroso de acesso à WLAN (</w:t>
-      </w:r>
-      <w:r>
-        <w:rPr>
-          <w:i/>
-          <w:iCs/>
-        </w:rPr>
-        <w:t>Wireless Local Area Network</w:t>
+        <w:t>Acesso Inicial</w:t>
+      </w:r>
+      <w:r>
+        <w:t xml:space="preserve">: </w:t>
+      </w:r>
+      <w:r>
+        <w:t>O objetivo do adversário nesta tática é obter o primeiro ponto de apoio na rede. As técnicas prioritárias identificadas incluem o uso de contas válidas e a exploração de aplicações voltadas para a rede externa. Como mitigação arquitetural, propõe-se um controle rigoroso de acesso à WLAN (</w:t>
+      </w:r>
+      <w:r>
+        <w:rPr>
+          <w:i/>
+          <w:iCs/>
+        </w:rPr>
+        <w:t xml:space="preserve">Wireless Local </w:t>
+      </w:r>
+      <w:proofErr w:type="spellStart"/>
+      <w:r>
+        <w:rPr>
+          <w:i/>
+          <w:iCs/>
+        </w:rPr>
+        <w:t>Area</w:t>
+      </w:r>
+      <w:proofErr w:type="spellEnd"/>
+      <w:r>
+        <w:rPr>
+          <w:i/>
+          <w:iCs/>
+        </w:rPr>
+        <w:t xml:space="preserve"> Network</w:t>
       </w:r>
       <w:r>
         <w:t>) e a segregação absoluta do tráfego discente. A implementação técnica consistirá na utilização do protocolo de segurança WPA2 (</w:t>
@@ -594,7 +606,23 @@
           <w:i/>
           <w:iCs/>
         </w:rPr>
-        <w:t>Wi-Fi Protected Access 2</w:t>
+        <w:t xml:space="preserve">Wi-Fi </w:t>
+      </w:r>
+      <w:proofErr w:type="spellStart"/>
+      <w:r>
+        <w:rPr>
+          <w:i/>
+          <w:iCs/>
+        </w:rPr>
+        <w:t>Protected</w:t>
+      </w:r>
+      <w:proofErr w:type="spellEnd"/>
+      <w:r>
+        <w:rPr>
+          <w:i/>
+          <w:iCs/>
+        </w:rPr>
+        <w:t xml:space="preserve"> Access 2</w:t>
       </w:r>
       <w:r>
         <w:t xml:space="preserve">) em modo </w:t>
@@ -614,7 +642,39 @@
           <w:i/>
           <w:iCs/>
         </w:rPr>
-        <w:t>Remote Authentication Dial-In User Service</w:t>
+        <w:t xml:space="preserve">Remote </w:t>
+      </w:r>
+      <w:proofErr w:type="spellStart"/>
+      <w:r>
+        <w:rPr>
+          <w:i/>
+          <w:iCs/>
+        </w:rPr>
+        <w:t>Authentication</w:t>
+      </w:r>
+      <w:proofErr w:type="spellEnd"/>
+      <w:r>
+        <w:rPr>
+          <w:i/>
+          <w:iCs/>
+        </w:rPr>
+        <w:t xml:space="preserve"> Dial-In </w:t>
+      </w:r>
+      <w:proofErr w:type="spellStart"/>
+      <w:r>
+        <w:rPr>
+          <w:i/>
+          <w:iCs/>
+        </w:rPr>
+        <w:t>User</w:t>
+      </w:r>
+      <w:proofErr w:type="spellEnd"/>
+      <w:r>
+        <w:rPr>
+          <w:i/>
+          <w:iCs/>
+        </w:rPr>
+        <w:t xml:space="preserve"> Service</w:t>
       </w:r>
       <w:r>
         <w:t>), além da criação de uma VLAN (</w:t>
@@ -624,7 +684,23 @@
           <w:i/>
           <w:iCs/>
         </w:rPr>
-        <w:t>Virtual Local Area Network</w:t>
+        <w:t xml:space="preserve">Virtual Local </w:t>
+      </w:r>
+      <w:proofErr w:type="spellStart"/>
+      <w:r>
+        <w:rPr>
+          <w:i/>
+          <w:iCs/>
+        </w:rPr>
+        <w:t>Area</w:t>
+      </w:r>
+      <w:proofErr w:type="spellEnd"/>
+      <w:r>
+        <w:rPr>
+          <w:i/>
+          <w:iCs/>
+        </w:rPr>
+        <w:t xml:space="preserve"> Network</w:t>
       </w:r>
       <w:r>
         <w:t>) dedicada exclusivamente aos equipamentos dos alunos.</w:t>
@@ -636,18 +712,9 @@
         <w:ind w:right="2"/>
       </w:pPr>
       <w:r>
-        <w:t>Acesso a Credenciais (</w:t>
-      </w:r>
-      <w:r>
-        <w:rPr>
-          <w:i/>
-          <w:iCs/>
-        </w:rPr>
-        <w:t>Credential Access</w:t>
-      </w:r>
-      <w:r>
-        <w:t xml:space="preserve">): O foco desta tática é a captura de senhas, </w:t>
-      </w:r>
+        <w:t xml:space="preserve">Acesso a Credenciais: O foco desta tática é a captura de senhas, </w:t>
+      </w:r>
+      <w:proofErr w:type="spellStart"/>
       <w:r>
         <w:rPr>
           <w:i/>
@@ -655,6 +722,7 @@
         </w:rPr>
         <w:t>hashes</w:t>
       </w:r>
+      <w:proofErr w:type="spellEnd"/>
       <w:r>
         <w:t xml:space="preserve"> ou </w:t>
       </w:r>
@@ -666,64 +734,83 @@
         <w:t>tokens</w:t>
       </w:r>
       <w:r>
-        <w:t xml:space="preserve"> de acesso. As técnicas abordadas para este cenário são a interceptação de tráfego (</w:t>
-      </w:r>
-      <w:r>
-        <w:rPr>
-          <w:i/>
-          <w:iCs/>
-        </w:rPr>
-        <w:t>Network Sniffing</w:t>
-      </w:r>
-      <w:r>
-        <w:t>) e os ataques de força bruta (</w:t>
-      </w:r>
-      <w:r>
-        <w:rPr>
-          <w:i/>
-          <w:iCs/>
-        </w:rPr>
-        <w:t>Brute Force</w:t>
-      </w:r>
-      <w:r>
-        <w:t>). Para mitigar essas ameaças, a arquitetura prevê a criptografia obrigatória dos protocolos de gerência e a proteção em camada de enlace (</w:t>
-      </w:r>
-      <w:r>
-        <w:rPr>
-          <w:i/>
-          <w:iCs/>
-        </w:rPr>
-        <w:t>Layer 2</w:t>
-      </w:r>
-      <w:r>
-        <w:t>) nas portas físicas dos equipamentos. Tecnicamente, essa diretriz se traduz na adoção exclusiva do protocolo SSHv2 (</w:t>
-      </w:r>
-      <w:r>
-        <w:rPr>
-          <w:i/>
-          <w:iCs/>
-        </w:rPr>
-        <w:t>Secure Shell version 2</w:t>
+        <w:t xml:space="preserve"> de acesso. As técnicas abordadas para este cenário são a interceptação de tráfego e os ataques de força bruta</w:t>
+      </w:r>
+      <w:r>
+        <w:t>.</w:t>
+      </w:r>
+      <w:r>
+        <w:t xml:space="preserve"> Para mitigar essas ameaças, a arquitetura prevê a criptografia obrigatória dos protocolos de gerência e a proteção em camada de enlace  nas portas físicas dos equipamentos. Tecnicamente, essa diretriz se traduz na adoção exclusiva do protocolo SSHv2 (</w:t>
+      </w:r>
+      <w:proofErr w:type="spellStart"/>
+      <w:r>
+        <w:rPr>
+          <w:i/>
+          <w:iCs/>
+        </w:rPr>
+        <w:t>Secure</w:t>
+      </w:r>
+      <w:proofErr w:type="spellEnd"/>
+      <w:r>
+        <w:rPr>
+          <w:i/>
+          <w:iCs/>
+        </w:rPr>
+        <w:t xml:space="preserve"> Shell </w:t>
+      </w:r>
+      <w:proofErr w:type="spellStart"/>
+      <w:r>
+        <w:rPr>
+          <w:i/>
+          <w:iCs/>
+        </w:rPr>
+        <w:t>version</w:t>
+      </w:r>
+      <w:proofErr w:type="spellEnd"/>
+      <w:r>
+        <w:rPr>
+          <w:i/>
+          <w:iCs/>
+        </w:rPr>
+        <w:t xml:space="preserve"> 2</w:t>
       </w:r>
       <w:r>
         <w:t xml:space="preserve">) para qualquer acesso remoto de administração e na aplicação do recurso </w:t>
       </w:r>
-      <w:r>
-        <w:rPr>
-          <w:i/>
-          <w:iCs/>
-        </w:rPr>
-        <w:t>Port Security</w:t>
+      <w:proofErr w:type="spellStart"/>
+      <w:r>
+        <w:rPr>
+          <w:i/>
+          <w:iCs/>
+        </w:rPr>
+        <w:t>Port</w:t>
+      </w:r>
+      <w:proofErr w:type="spellEnd"/>
+      <w:r>
+        <w:rPr>
+          <w:i/>
+          <w:iCs/>
+        </w:rPr>
+        <w:t xml:space="preserve"> Security</w:t>
       </w:r>
       <w:r>
         <w:t xml:space="preserve"> (operando no modo </w:t>
       </w:r>
-      <w:r>
-        <w:rPr>
-          <w:i/>
-          <w:iCs/>
-        </w:rPr>
-        <w:t>Sticky MAC</w:t>
+      <w:proofErr w:type="spellStart"/>
+      <w:r>
+        <w:rPr>
+          <w:i/>
+          <w:iCs/>
+        </w:rPr>
+        <w:t>Sticky</w:t>
+      </w:r>
+      <w:proofErr w:type="spellEnd"/>
+      <w:r>
+        <w:rPr>
+          <w:i/>
+          <w:iCs/>
+        </w:rPr>
+        <w:t xml:space="preserve"> MAC</w:t>
       </w:r>
       <w:r>
         <w:t xml:space="preserve"> - </w:t>
@@ -733,8 +820,17 @@
           <w:i/>
           <w:iCs/>
         </w:rPr>
-        <w:t>Media Access Control</w:t>
-      </w:r>
+        <w:t xml:space="preserve">Media Access </w:t>
+      </w:r>
+      <w:proofErr w:type="spellStart"/>
+      <w:r>
+        <w:rPr>
+          <w:i/>
+          <w:iCs/>
+        </w:rPr>
+        <w:t>Control</w:t>
+      </w:r>
+      <w:proofErr w:type="spellEnd"/>
       <w:r>
         <w:t xml:space="preserve">) nas interfaces de </w:t>
       </w:r>
@@ -775,35 +871,24 @@
         <w:ind w:right="2"/>
       </w:pPr>
       <w:r>
-        <w:t>Movimentação Lateral (</w:t>
-      </w:r>
-      <w:r>
-        <w:rPr>
-          <w:i/>
-          <w:iCs/>
-        </w:rPr>
-        <w:t>Lateral Movement</w:t>
-      </w:r>
-      <w:r>
-        <w:t>): Uma vez estabelecido o acesso inicial, o invasor busca explorar a rede para alcançar sistemas críticos. As técnicas mapeadas envolvem a exploração de serviços remotos (</w:t>
-      </w:r>
-      <w:r>
-        <w:rPr>
-          <w:i/>
-          <w:iCs/>
-        </w:rPr>
-        <w:t>Remote Services</w:t>
-      </w:r>
-      <w:r>
-        <w:t>) e o uso de portas de comunicação não padronizadas (</w:t>
-      </w:r>
-      <w:r>
-        <w:rPr>
-          <w:i/>
-          <w:iCs/>
-        </w:rPr>
-        <w:t>Non-Standard Port</w:t>
-      </w:r>
+        <w:t>Movimentação Lateral: Uma vez estabelecido o acesso inicial, o invasor busca explorar a rede para alcançar sistemas críticos. As técnicas mapeadas envolvem a exploração de serviços remotos  e o uso de portas de comunicação não padronizadas (</w:t>
+      </w:r>
+      <w:r>
+        <w:rPr>
+          <w:i/>
+          <w:iCs/>
+        </w:rPr>
+        <w:t xml:space="preserve">Non-Standard </w:t>
+      </w:r>
+      <w:proofErr w:type="spellStart"/>
+      <w:r>
+        <w:rPr>
+          <w:i/>
+          <w:iCs/>
+        </w:rPr>
+        <w:t>Port</w:t>
+      </w:r>
+      <w:proofErr w:type="spellEnd"/>
       <w:r>
         <w:t xml:space="preserve">). A mitigação arquitetural adotada é a segmentação lógica estrita e a inspeção profunda do tráfego </w:t>
       </w:r>
@@ -812,41 +897,127 @@
           <w:i/>
           <w:iCs/>
         </w:rPr>
+        <w:t>Inter-VLAN</w:t>
+      </w:r>
+      <w:r>
+        <w:t xml:space="preserve">. A implementação técnica se dará pela configuração de roteamento do tipo </w:t>
+      </w:r>
+      <w:proofErr w:type="spellStart"/>
+      <w:r>
+        <w:rPr>
+          <w:i/>
+          <w:iCs/>
+        </w:rPr>
+        <w:t>Router</w:t>
+      </w:r>
+      <w:proofErr w:type="spellEnd"/>
+      <w:r>
+        <w:rPr>
+          <w:i/>
+          <w:iCs/>
+        </w:rPr>
+        <w:t>-</w:t>
+      </w:r>
+      <w:proofErr w:type="spellStart"/>
+      <w:r>
+        <w:rPr>
+          <w:i/>
+          <w:iCs/>
+        </w:rPr>
+        <w:t>on</w:t>
+      </w:r>
+      <w:proofErr w:type="spellEnd"/>
+      <w:r>
+        <w:rPr>
+          <w:i/>
+          <w:iCs/>
+        </w:rPr>
+        <w:t>-a-Stick</w:t>
+      </w:r>
+      <w:r>
+        <w:t xml:space="preserve"> ou pela utilização de um</w:t>
+      </w:r>
+      <w:r>
+        <w:t xml:space="preserve"> sw</w:t>
+      </w:r>
+      <w:r>
+        <w:t>itch</w:t>
+      </w:r>
+      <w:r>
+        <w:t xml:space="preserve"> </w:t>
+      </w:r>
+      <w:proofErr w:type="spellStart"/>
+      <w:r>
+        <w:rPr>
+          <w:i/>
+          <w:iCs/>
+        </w:rPr>
+        <w:t>Layer</w:t>
+      </w:r>
+      <w:proofErr w:type="spellEnd"/>
+      <w:r>
+        <w:rPr>
+          <w:i/>
+          <w:iCs/>
+        </w:rPr>
+        <w:t xml:space="preserve"> 3</w:t>
+      </w:r>
+      <w:r>
+        <w:rPr>
+          <w:i/>
+          <w:iCs/>
+        </w:rPr>
+        <w:t>,</w:t>
+      </w:r>
+      <w:r>
+        <w:t xml:space="preserve"> aplicando </w:t>
+      </w:r>
+      <w:proofErr w:type="spellStart"/>
+      <w:r>
+        <w:t>ACLs</w:t>
+      </w:r>
+      <w:proofErr w:type="spellEnd"/>
+      <w:r>
+        <w:t xml:space="preserve"> (</w:t>
+      </w:r>
+      <w:r>
+        <w:rPr>
+          <w:i/>
+          <w:iCs/>
+        </w:rPr>
+        <w:t xml:space="preserve">Access </w:t>
+      </w:r>
+      <w:proofErr w:type="spellStart"/>
+      <w:r>
+        <w:rPr>
+          <w:i/>
+          <w:iCs/>
+        </w:rPr>
+        <w:t>Control</w:t>
+      </w:r>
+      <w:proofErr w:type="spellEnd"/>
+      <w:r>
+        <w:rPr>
+          <w:i/>
+          <w:iCs/>
+        </w:rPr>
+        <w:t xml:space="preserve"> </w:t>
+      </w:r>
+      <w:proofErr w:type="spellStart"/>
+      <w:r>
+        <w:rPr>
+          <w:i/>
+          <w:iCs/>
+        </w:rPr>
+        <w:t>Lists</w:t>
+      </w:r>
+      <w:proofErr w:type="spellEnd"/>
+      <w:r>
+        <w:t xml:space="preserve">) estendidas para bloquear </w:t>
+      </w:r>
+      <w:r>
         <w:lastRenderedPageBreak/>
-        <w:t>Inter-VLAN</w:t>
-      </w:r>
-      <w:r>
-        <w:t xml:space="preserve">. A implementação técnica se dará pela configuração de roteamento do tipo </w:t>
-      </w:r>
-      <w:r>
-        <w:rPr>
-          <w:i/>
-          <w:iCs/>
-        </w:rPr>
-        <w:t>Router-on-a-Stick</w:t>
-      </w:r>
-      <w:r>
-        <w:t xml:space="preserve"> ou pela utilização de um </w:t>
-      </w:r>
-      <w:r>
-        <w:rPr>
-          <w:i/>
-          <w:iCs/>
-        </w:rPr>
-        <w:t>Layer 3 Switch</w:t>
-      </w:r>
-      <w:r>
-        <w:t>, aplicando ACLs (</w:t>
-      </w:r>
-      <w:r>
-        <w:rPr>
-          <w:i/>
-          <w:iCs/>
-        </w:rPr>
-        <w:t>Access Control Lists</w:t>
-      </w:r>
-      <w:r>
-        <w:t>) estendidas para bloquear sumariamente todo o tráfego que não for explicitamente permitido entre as diferentes redes virtuais da instituição.</w:t>
+        <w:t>sumariamente todo o tráfego que não for explicitamente permitido entre as diferentes redes virtuais da instituição.</w:t>
       </w:r>
     </w:p>
     <w:p>
@@ -855,75 +1026,208 @@
         <w:ind w:right="2"/>
       </w:pPr>
       <w:r>
-        <w:t>Impacto (</w:t>
-      </w:r>
-      <w:r>
-        <w:rPr>
-          <w:i/>
-          <w:iCs/>
-        </w:rPr>
-        <w:t>Impact</w:t>
-      </w:r>
-      <w:r>
-        <w:t>): O objetivo final do adversário pode ser interromper a disponibilidade dos serviços acadêmicos e administrativos. A técnica prioritária mapeada é a negação de serviço na rede (</w:t>
-      </w:r>
-      <w:r>
-        <w:rPr>
-          <w:i/>
-          <w:iCs/>
-        </w:rPr>
-        <w:t>Network Denial of Service - DoS</w:t>
-      </w:r>
+        <w:t>Impacto</w:t>
+      </w:r>
+      <w:r>
+        <w:t>:</w:t>
+      </w:r>
+      <w:r>
+        <w:t xml:space="preserve"> O objetivo final do adversário pode ser interromper a disponibilidade dos serviços acadêmicos e administrativos. A técnica prioritária mapeada é a negação de serviço na rede (</w:t>
+      </w:r>
+      <w:r>
+        <w:rPr>
+          <w:i/>
+          <w:iCs/>
+        </w:rPr>
+        <w:t xml:space="preserve">Network </w:t>
+      </w:r>
+      <w:proofErr w:type="spellStart"/>
+      <w:r>
+        <w:rPr>
+          <w:i/>
+          <w:iCs/>
+        </w:rPr>
+        <w:t>Denial</w:t>
+      </w:r>
+      <w:proofErr w:type="spellEnd"/>
+      <w:r>
+        <w:rPr>
+          <w:i/>
+          <w:iCs/>
+        </w:rPr>
+        <w:t xml:space="preserve"> </w:t>
+      </w:r>
+      <w:proofErr w:type="spellStart"/>
+      <w:r>
+        <w:rPr>
+          <w:i/>
+          <w:iCs/>
+        </w:rPr>
+        <w:t>of</w:t>
+      </w:r>
+      <w:proofErr w:type="spellEnd"/>
+      <w:r>
+        <w:rPr>
+          <w:i/>
+          <w:iCs/>
+        </w:rPr>
+        <w:t xml:space="preserve"> Service - </w:t>
+      </w:r>
+      <w:proofErr w:type="spellStart"/>
+      <w:r>
+        <w:rPr>
+          <w:i/>
+          <w:iCs/>
+        </w:rPr>
+        <w:t>DoS</w:t>
+      </w:r>
+      <w:proofErr w:type="spellEnd"/>
       <w:r>
         <w:t>). A mitigação arquitetural consiste na filtragem ostensiva e na prevenção de intrusões no tráfego de saída e entrada na WAN (</w:t>
       </w:r>
-      <w:r>
-        <w:rPr>
-          <w:i/>
-          <w:iCs/>
-        </w:rPr>
-        <w:t>Wide Area Network</w:t>
-      </w:r>
-      <w:r>
-        <w:t>), além da mitigação de tempestades de transmissão (</w:t>
-      </w:r>
-      <w:r>
-        <w:rPr>
-          <w:i/>
-          <w:iCs/>
-        </w:rPr>
-        <w:t>Broadcast Storms</w:t>
-      </w:r>
-      <w:r>
-        <w:t>) na rede local. Em termos de implementação técnica, o projeto contempla o posicionamento de um NGFW (</w:t>
-      </w:r>
-      <w:r>
-        <w:rPr>
-          <w:i/>
-          <w:iCs/>
-        </w:rPr>
-        <w:t>Next-Generation Firewall</w:t>
+      <w:proofErr w:type="spellStart"/>
+      <w:r>
+        <w:rPr>
+          <w:i/>
+          <w:iCs/>
+        </w:rPr>
+        <w:t>Wide</w:t>
+      </w:r>
+      <w:proofErr w:type="spellEnd"/>
+      <w:r>
+        <w:rPr>
+          <w:i/>
+          <w:iCs/>
+        </w:rPr>
+        <w:t xml:space="preserve"> </w:t>
+      </w:r>
+      <w:proofErr w:type="spellStart"/>
+      <w:r>
+        <w:rPr>
+          <w:i/>
+          <w:iCs/>
+        </w:rPr>
+        <w:t>Area</w:t>
+      </w:r>
+      <w:proofErr w:type="spellEnd"/>
+      <w:r>
+        <w:rPr>
+          <w:i/>
+          <w:iCs/>
+        </w:rPr>
+        <w:t xml:space="preserve"> Network</w:t>
+      </w:r>
+      <w:r>
+        <w:t xml:space="preserve">), além da mitigação de tempestades de  </w:t>
+      </w:r>
+      <w:r>
+        <w:rPr>
+          <w:i/>
+          <w:iCs/>
+        </w:rPr>
+        <w:t xml:space="preserve">Broadcast </w:t>
+      </w:r>
+      <w:proofErr w:type="spellStart"/>
+      <w:r>
+        <w:rPr>
+          <w:i/>
+          <w:iCs/>
+        </w:rPr>
+        <w:t>Storms</w:t>
+      </w:r>
+      <w:proofErr w:type="spellEnd"/>
+      <w:r>
+        <w:t xml:space="preserve"> </w:t>
+      </w:r>
+      <w:r>
+        <w:t>na rede local. Em termos de implementação técnica, o projeto contempla o posicionamento de um NGFW (</w:t>
+      </w:r>
+      <w:r>
+        <w:rPr>
+          <w:i/>
+          <w:iCs/>
+        </w:rPr>
+        <w:t>Next-</w:t>
+      </w:r>
+      <w:proofErr w:type="spellStart"/>
+      <w:r>
+        <w:rPr>
+          <w:i/>
+          <w:iCs/>
+        </w:rPr>
+        <w:t>Generation</w:t>
+      </w:r>
+      <w:proofErr w:type="spellEnd"/>
+      <w:r>
+        <w:rPr>
+          <w:i/>
+          <w:iCs/>
+        </w:rPr>
+        <w:t xml:space="preserve"> Firewall</w:t>
       </w:r>
       <w:r>
         <w:t>) com a funcionalidade de IPS (</w:t>
       </w:r>
-      <w:r>
-        <w:rPr>
-          <w:i/>
-          <w:iCs/>
-        </w:rPr>
-        <w:t>Intrusion Prevention System</w:t>
+      <w:proofErr w:type="spellStart"/>
+      <w:r>
+        <w:rPr>
+          <w:i/>
+          <w:iCs/>
+        </w:rPr>
+        <w:t>Intrusion</w:t>
+      </w:r>
+      <w:proofErr w:type="spellEnd"/>
+      <w:r>
+        <w:rPr>
+          <w:i/>
+          <w:iCs/>
+        </w:rPr>
+        <w:t xml:space="preserve"> </w:t>
+      </w:r>
+      <w:proofErr w:type="spellStart"/>
+      <w:r>
+        <w:rPr>
+          <w:i/>
+          <w:iCs/>
+        </w:rPr>
+        <w:t>Prevention</w:t>
+      </w:r>
+      <w:proofErr w:type="spellEnd"/>
+      <w:r>
+        <w:rPr>
+          <w:i/>
+          <w:iCs/>
+        </w:rPr>
+        <w:t xml:space="preserve"> System</w:t>
       </w:r>
       <w:r>
         <w:t xml:space="preserve">) ativada na borda da rede, somado à configuração do recurso de </w:t>
       </w:r>
-      <w:r>
-        <w:rPr>
-          <w:i/>
-          <w:iCs/>
-        </w:rPr>
-        <w:t>Storm Control</w:t>
-      </w:r>
+      <w:proofErr w:type="spellStart"/>
+      <w:r>
+        <w:rPr>
+          <w:i/>
+          <w:iCs/>
+        </w:rPr>
+        <w:t>Storm</w:t>
+      </w:r>
+      <w:proofErr w:type="spellEnd"/>
+      <w:r>
+        <w:rPr>
+          <w:i/>
+          <w:iCs/>
+        </w:rPr>
+        <w:t xml:space="preserve"> </w:t>
+      </w:r>
+      <w:proofErr w:type="spellStart"/>
+      <w:r>
+        <w:rPr>
+          <w:i/>
+          <w:iCs/>
+        </w:rPr>
+        <w:t>Control</w:t>
+      </w:r>
+      <w:proofErr w:type="spellEnd"/>
       <w:r>
         <w:t xml:space="preserve"> nos </w:t>
       </w:r>
@@ -1008,6 +1312,12 @@
       <w:pPr>
         <w:spacing w:after="276"/>
         <w:ind w:right="2"/>
+      </w:pPr>
+    </w:p>
+    <w:p>
+      <w:pPr>
+        <w:spacing w:after="276"/>
+        <w:ind w:right="2"/>
         <w:rPr>
           <w:b/>
           <w:bCs/>
@@ -1028,17 +1338,25 @@
         <w:ind w:right="2" w:firstLine="0"/>
       </w:pPr>
       <w:r>
-        <w:t xml:space="preserve">CISCO SYSTEMS. </w:t>
+        <w:t xml:space="preserve">KUROSE, James F.; ROSS, Keith W. </w:t>
       </w:r>
       <w:r>
         <w:rPr>
           <w:b/>
           <w:bCs/>
         </w:rPr>
-        <w:t>Cisco Packet Tracer e Cisco Networking Academy</w:t>
-      </w:r>
-      <w:r>
-        <w:t>. San Jose: Cisco Systems, 2026. Disponível em: https://www.netacad.com/courses/packet-tracer. Acesso em: 24 mar. 2026.</w:t>
+        <w:t>Redes de Computadores e a Internet: Uma Abordagem Top-Down</w:t>
+      </w:r>
+      <w:r>
+        <w:t xml:space="preserve">. 8. ed. São Paulo: Pearson </w:t>
+      </w:r>
+      <w:proofErr w:type="spellStart"/>
+      <w:r>
+        <w:t>Education</w:t>
+      </w:r>
+      <w:proofErr w:type="spellEnd"/>
+      <w:r>
+        <w:t>, 2021.</w:t>
       </w:r>
     </w:p>
     <w:p>
@@ -1047,74 +1365,31 @@
         <w:ind w:right="2" w:firstLine="0"/>
       </w:pPr>
       <w:r>
-        <w:t xml:space="preserve">KUROSE, James F.; ROSS, Keith W. </w:t>
+        <w:t xml:space="preserve">STALLINGS, William. </w:t>
       </w:r>
       <w:r>
         <w:rPr>
           <w:b/>
           <w:bCs/>
         </w:rPr>
-        <w:t>Redes de Computadores e a Internet: Uma Abordagem Top-Down</w:t>
-      </w:r>
-      <w:r>
-        <w:t>. 8. ed. São Paulo: Pearson Education, 2021.</w:t>
-      </w:r>
-    </w:p>
-    <w:p>
-      <w:pPr>
-        <w:spacing w:after="276"/>
-        <w:ind w:right="2" w:firstLine="0"/>
-      </w:pPr>
-      <w:r>
-        <w:t xml:space="preserve">MITRE CORPORATION. </w:t>
-      </w:r>
-      <w:r>
-        <w:rPr>
-          <w:b/>
-          <w:bCs/>
-        </w:rPr>
-        <w:t>MITRE ATT&amp;CK®: Design and Philosophy</w:t>
-      </w:r>
-      <w:r>
-        <w:t>. The MITRE Corporation, 2026. Disponível em: https://attack.mitre.org/docs/ATTACK_Design_and_Philosophy_March_2020.pdf. Acesso em: 24 mar. 2026.</w:t>
-      </w:r>
-    </w:p>
-    <w:p>
-      <w:pPr>
-        <w:spacing w:after="276"/>
-        <w:ind w:right="2" w:firstLine="0"/>
-      </w:pPr>
-      <w:r>
-        <w:t xml:space="preserve">ROSE, Scott et al. </w:t>
-      </w:r>
-      <w:r>
-        <w:rPr>
-          <w:b/>
-          <w:bCs/>
-        </w:rPr>
-        <w:t>Zero Trust Architecture</w:t>
-      </w:r>
-      <w:r>
-        <w:t>. NIST Special Publication 800-207. Gaithersburg: National Institute of Standards and Technology, 2020. Disponível em: https://csrc.nist.gov/publications/detail/sp/800-207/final. Acesso em: 24 mar. 2026.</w:t>
-      </w:r>
-    </w:p>
-    <w:p>
-      <w:pPr>
-        <w:spacing w:after="276"/>
-        <w:ind w:right="2" w:firstLine="0"/>
-      </w:pPr>
-      <w:r>
-        <w:t xml:space="preserve">STALLINGS, William. </w:t>
-      </w:r>
-      <w:r>
-        <w:rPr>
-          <w:b/>
-          <w:bCs/>
-        </w:rPr>
         <w:t>Criptografia e Segurança de Redes: Princípios e Práticas</w:t>
       </w:r>
       <w:r>
-        <w:t>. 7. ed. São Paulo: Pearson Education, 2019.</w:t>
+        <w:t xml:space="preserve">. </w:t>
+      </w:r>
+      <w:r>
+        <w:t>6</w:t>
+      </w:r>
+      <w:r>
+        <w:t xml:space="preserve">. ed. São Paulo: Pearson </w:t>
+      </w:r>
+      <w:proofErr w:type="spellStart"/>
+      <w:r>
+        <w:t>Education</w:t>
+      </w:r>
+      <w:proofErr w:type="spellEnd"/>
+      <w:r>
+        <w:t>, 2019.</w:t>
       </w:r>
     </w:p>
     <w:p>
@@ -4988,6 +5263,7 @@
   <w:style w:type="character" w:default="1" w:styleId="Fontepargpadro">
     <w:name w:val="Default Paragraph Font"/>
     <w:uiPriority w:val="1"/>
+    <w:semiHidden/>
     <w:unhideWhenUsed/>
   </w:style>
   <w:style w:type="table" w:default="1" w:styleId="Tabelanormal">
@@ -5574,14 +5850,12 @@
 </file>
 
 <file path=customXml/item2.xml><?xml version="1.0" encoding="utf-8"?>
-<p:properties xmlns:p="http://schemas.microsoft.com/office/2006/metadata/properties" xmlns:xsi="http://www.w3.org/2001/XMLSchema-instance" xmlns:pc="http://schemas.microsoft.com/office/infopath/2007/PartnerControls">
-  <documentManagement>
-    <lcf76f155ced4ddcb4097134ff3c332f xmlns="5d7f0489-8846-45d9-adcc-15b3db2ea5a3">
-      <Terms xmlns="http://schemas.microsoft.com/office/infopath/2007/PartnerControls"/>
-    </lcf76f155ced4ddcb4097134ff3c332f>
-    <TaxCatchAll xmlns="7838680e-436f-42f0-a21d-44a22fbba5e5" xsi:nil="true"/>
-  </documentManagement>
-</p:properties>
+<?mso-contentType ?>
+<FormTemplates xmlns="http://schemas.microsoft.com/sharepoint/v3/contenttype/forms">
+  <Display>DocumentLibraryForm</Display>
+  <Edit>DocumentLibraryForm</Edit>
+  <New>DocumentLibraryForm</New>
+</FormTemplates>
 </file>
 
 <file path=customXml/item3.xml><?xml version="1.0" encoding="utf-8"?>
@@ -5780,29 +6054,29 @@
 </file>
 
 <file path=customXml/item4.xml><?xml version="1.0" encoding="utf-8"?>
-<?mso-contentType ?>
-<FormTemplates xmlns="http://schemas.microsoft.com/sharepoint/v3/contenttype/forms">
-  <Display>DocumentLibraryForm</Display>
-  <Edit>DocumentLibraryForm</Edit>
-  <New>DocumentLibraryForm</New>
-</FormTemplates>
+<p:properties xmlns:p="http://schemas.microsoft.com/office/2006/metadata/properties" xmlns:xsi="http://www.w3.org/2001/XMLSchema-instance" xmlns:pc="http://schemas.microsoft.com/office/infopath/2007/PartnerControls">
+  <documentManagement>
+    <lcf76f155ced4ddcb4097134ff3c332f xmlns="5d7f0489-8846-45d9-adcc-15b3db2ea5a3">
+      <Terms xmlns="http://schemas.microsoft.com/office/infopath/2007/PartnerControls"/>
+    </lcf76f155ced4ddcb4097134ff3c332f>
+    <TaxCatchAll xmlns="7838680e-436f-42f0-a21d-44a22fbba5e5" xsi:nil="true"/>
+  </documentManagement>
+</p:properties>
 </file>
 
 <file path=customXml/itemProps1.xml><?xml version="1.0" encoding="utf-8"?>
 <ds:datastoreItem xmlns:ds="http://schemas.openxmlformats.org/officeDocument/2006/customXml" ds:itemID="{A6881205-5FE3-4ABC-A062-EDF5B5E16400}">
   <ds:schemaRefs>
     <ds:schemaRef ds:uri="http://schemas.openxmlformats.org/officeDocument/2006/bibliography"/>
+    <ds:schemaRef ds:uri="http://www.w3.org/2000/xmlns/"/>
   </ds:schemaRefs>
 </ds:datastoreItem>
 </file>
 
 <file path=customXml/itemProps2.xml><?xml version="1.0" encoding="utf-8"?>
-<ds:datastoreItem xmlns:ds="http://schemas.openxmlformats.org/officeDocument/2006/customXml" ds:itemID="{828574F0-80FF-4BAE-AB67-C402CBBAF841}">
+<ds:datastoreItem xmlns:ds="http://schemas.openxmlformats.org/officeDocument/2006/customXml" ds:itemID="{DC63A60A-84F5-4110-9C5F-5DE9148E514C}">
   <ds:schemaRefs>
-    <ds:schemaRef ds:uri="http://schemas.microsoft.com/office/2006/metadata/properties"/>
-    <ds:schemaRef ds:uri="http://schemas.microsoft.com/office/infopath/2007/PartnerControls"/>
-    <ds:schemaRef ds:uri="5d7f0489-8846-45d9-adcc-15b3db2ea5a3"/>
-    <ds:schemaRef ds:uri="7838680e-436f-42f0-a21d-44a22fbba5e5"/>
+    <ds:schemaRef ds:uri="http://schemas.microsoft.com/sharepoint/v3/contenttype/forms"/>
   </ds:schemaRefs>
 </ds:datastoreItem>
 </file>
@@ -5812,24 +6086,23 @@
   <ds:schemaRefs>
     <ds:schemaRef ds:uri="http://schemas.microsoft.com/office/2006/metadata/contentType"/>
     <ds:schemaRef ds:uri="http://schemas.microsoft.com/office/2006/metadata/properties/metaAttributes"/>
+    <ds:schemaRef ds:uri="http://www.w3.org/2000/xmlns/"/>
     <ds:schemaRef ds:uri="http://www.w3.org/2001/XMLSchema"/>
-    <ds:schemaRef ds:uri="http://schemas.microsoft.com/office/2006/metadata/properties"/>
     <ds:schemaRef ds:uri="5d7f0489-8846-45d9-adcc-15b3db2ea5a3"/>
     <ds:schemaRef ds:uri="7838680e-436f-42f0-a21d-44a22fbba5e5"/>
-    <ds:schemaRef ds:uri="http://schemas.microsoft.com/office/2006/documentManagement/types"/>
-    <ds:schemaRef ds:uri="http://schemas.microsoft.com/office/infopath/2007/PartnerControls"/>
-    <ds:schemaRef ds:uri="http://schemas.openxmlformats.org/package/2006/metadata/core-properties"/>
-    <ds:schemaRef ds:uri="http://purl.org/dc/elements/1.1/"/>
-    <ds:schemaRef ds:uri="http://purl.org/dc/terms/"/>
-    <ds:schemaRef ds:uri="http://schemas.microsoft.com/internal/obd"/>
   </ds:schemaRefs>
 </ds:datastoreItem>
 </file>
 
 <file path=customXml/itemProps4.xml><?xml version="1.0" encoding="utf-8"?>
-<ds:datastoreItem xmlns:ds="http://schemas.openxmlformats.org/officeDocument/2006/customXml" ds:itemID="{DC63A60A-84F5-4110-9C5F-5DE9148E514C}">
+<ds:datastoreItem xmlns:ds="http://schemas.openxmlformats.org/officeDocument/2006/customXml" ds:itemID="{828574F0-80FF-4BAE-AB67-C402CBBAF841}">
   <ds:schemaRefs>
-    <ds:schemaRef ds:uri="http://schemas.microsoft.com/sharepoint/v3/contenttype/forms"/>
+    <ds:schemaRef ds:uri="http://schemas.microsoft.com/office/2006/metadata/properties"/>
+    <ds:schemaRef ds:uri="http://www.w3.org/2000/xmlns/"/>
+    <ds:schemaRef ds:uri="5d7f0489-8846-45d9-adcc-15b3db2ea5a3"/>
+    <ds:schemaRef ds:uri="http://schemas.microsoft.com/office/infopath/2007/PartnerControls"/>
+    <ds:schemaRef ds:uri="7838680e-436f-42f0-a21d-44a22fbba5e5"/>
+    <ds:schemaRef ds:uri="http://www.w3.org/2001/XMLSchema-instance"/>
   </ds:schemaRefs>
 </ds:datastoreItem>
 </file>
</xml_diff>